<commit_message>
For Bug 36035 70425 Update translations of layouts and templates of Slide masters for zh-CN template. Change default margins of Document amd Form template according to regional settings
</commit_message>
<xml_diff>
--- a/new/zh-CN/new.docx
+++ b/new/zh-CN/new.docx
@@ -9,7 +9,7 @@
     <w:sectPr>
       <w:type w:val="nextPage"/>
       <w:pgSz w:w="11906" w:h="16838"/>
-      <w:pgMar w:top="1134" w:right="850" w:bottom="1134" w:left="1701" w:gutter="0" w:header="709" w:footer="709"/>
+      <w:pgMar w:top="1440" w:right="1800" w:bottom="1440" w:left="1800" w:gutter="0" w:header="851" w:footer="992"/>
       <w:cols w:space="708"/>
       <w:docGrid w:linePitch="360"/>
     </w:sectPr>
@@ -264,14 +264,74 @@
     </a:clrScheme>
     <a:fontScheme name="Office Classic 2">
       <a:majorFont>
-        <a:latin typeface="Arial"/>
-        <a:ea typeface="Arial"/>
-        <a:cs typeface="Arial"/>
+        <a:latin typeface="等线 Light" panose="020F0302020204030204"/>
+        <a:ea typeface=""/>
+        <a:cs typeface=""/>
+        <a:font script="Jpan" typeface="游ゴシック Light"/>
+        <a:font script="Hang" typeface="맑은 고딕"/>
+        <a:font script="Hans" typeface="等线 Light"/>
+        <a:font script="Hant" typeface="新細明體"/>
+        <a:font script="Arab" typeface="Times New Roman"/>
+        <a:font script="Hebr" typeface="Times New Roman"/>
+        <a:font script="Thai" typeface="Angsana New"/>
+        <a:font script="Ethi" typeface="Nyala"/>
+        <a:font script="Beng" typeface="Vrinda"/>
+        <a:font script="Gujr" typeface="Shruti"/>
+        <a:font script="Khmr" typeface="MoolBoran"/>
+        <a:font script="Knda" typeface="Tunga"/>
+        <a:font script="Guru" typeface="Raavi"/>
+        <a:font script="Cans" typeface="Euphemia"/>
+        <a:font script="Cher" typeface="Plantagenet Cherokee"/>
+        <a:font script="Yiii" typeface="Microsoft Yi Baiti"/>
+        <a:font script="Tibt" typeface="Microsoft Himalaya"/>
+        <a:font script="Thaa" typeface="MV Boli"/>
+        <a:font script="Deva" typeface="Mangal"/>
+        <a:font script="Telu" typeface="Gautami"/>
+        <a:font script="Taml" typeface="Latha"/>
+        <a:font script="Syrc" typeface="Estrangelo Edessa"/>
+        <a:font script="Orya" typeface="Kalinga"/>
+        <a:font script="Mlym" typeface="Kartika"/>
+        <a:font script="Laoo" typeface="DokChampa"/>
+        <a:font script="Sinh" typeface="Iskoola Pota"/>
+        <a:font script="Mong" typeface="Mongolian Baiti"/>
+        <a:font script="Viet" typeface="Times New Roman"/>
+        <a:font script="Uigh" typeface="Microsoft Uighur"/>
+        <a:font script="Geor" typeface="Sylfaen"/>
       </a:majorFont>
       <a:minorFont>
-        <a:latin typeface="Arial"/>
-        <a:ea typeface="Arial"/>
-        <a:cs typeface="Arial"/>
+        <a:latin typeface="等线" panose="020F0502020204030204"/>
+        <a:ea typeface=""/>
+        <a:cs typeface=""/>
+        <a:font script="Jpan" typeface="游明朝"/>
+        <a:font script="Hang" typeface="맑은 고딕"/>
+        <a:font script="Hans" typeface="等线"/>
+        <a:font script="Hant" typeface="新細明體"/>
+        <a:font script="Arab" typeface="Arial"/>
+        <a:font script="Hebr" typeface="Arial"/>
+        <a:font script="Thai" typeface="Cordia New"/>
+        <a:font script="Ethi" typeface="Nyala"/>
+        <a:font script="Beng" typeface="Vrinda"/>
+        <a:font script="Gujr" typeface="Shruti"/>
+        <a:font script="Khmr" typeface="DaunPenh"/>
+        <a:font script="Knda" typeface="Tunga"/>
+        <a:font script="Guru" typeface="Raavi"/>
+        <a:font script="Cans" typeface="Euphemia"/>
+        <a:font script="Cher" typeface="Plantagenet Cherokee"/>
+        <a:font script="Yiii" typeface="Microsoft Yi Baiti"/>
+        <a:font script="Tibt" typeface="Microsoft Himalaya"/>
+        <a:font script="Thaa" typeface="MV Boli"/>
+        <a:font script="Deva" typeface="Mangal"/>
+        <a:font script="Telu" typeface="Gautami"/>
+        <a:font script="Taml" typeface="Latha"/>
+        <a:font script="Syrc" typeface="Estrangelo Edessa"/>
+        <a:font script="Orya" typeface="Kalinga"/>
+        <a:font script="Mlym" typeface="Kartika"/>
+        <a:font script="Laoo" typeface="DokChampa"/>
+        <a:font script="Sinh" typeface="Iskoola Pota"/>
+        <a:font script="Mong" typeface="Mongolian Baiti"/>
+        <a:font script="Viet" typeface="Arial"/>
+        <a:font script="Uigh" typeface="Microsoft Uighur"/>
+        <a:font script="Geor" typeface="Sylfaen"/>
       </a:minorFont>
     </a:fontScheme>
     <a:fmtScheme name="Office">

</xml_diff>